<commit_message>
Update RiskAssessment.docx - remove empty page
Co-Authored-By: Claude Sonnet 4.6 <noreply@anthropic.com>
</commit_message>
<xml_diff>
--- a/RiskAssessment.docx
+++ b/RiskAssessment.docx
@@ -313,7 +313,7 @@
                                               <w:sz w:val="26"/>
                                               <w:szCs w:val="26"/>
                                             </w:rPr>
-                                            <w:t xml:space="preserve">Henry </w:t>
+                                            <w:t>Henry</w:t>
                                           </w:r>
                                         </w:p>
                                       </w:sdtContent>
@@ -626,7 +626,7 @@
                                         <w:sz w:val="26"/>
                                         <w:szCs w:val="26"/>
                                       </w:rPr>
-                                      <w:t xml:space="preserve">Henry </w:t>
+                                      <w:t>Henry</w:t>
                                     </w:r>
                                   </w:p>
                                 </w:sdtContent>
@@ -6172,6 +6172,7 @@
               <w:rPr>
                 <w:rFonts w:ascii="Times New Roman" w:hAnsi="Times New Roman" w:cs="Times New Roman"/>
               </w:rPr>
+              <w:lastRenderedPageBreak/>
               <w:t>Medium</w:t>
             </w:r>
           </w:p>
@@ -6256,14 +6257,7 @@
               <w:rPr>
                 <w:rFonts w:ascii="Times New Roman" w:hAnsi="Times New Roman" w:cs="Times New Roman"/>
               </w:rPr>
-              <w:t xml:space="preserve">Field Tech Inside </w:t>
-            </w:r>
-            <w:r>
-              <w:rPr>
-                <w:rFonts w:ascii="Times New Roman" w:hAnsi="Times New Roman" w:cs="Times New Roman"/>
-              </w:rPr>
-              <w:lastRenderedPageBreak/>
-              <w:t xml:space="preserve">Attacker (Scenario 1) </w:t>
+              <w:t xml:space="preserve">Field Tech Inside Attacker (Scenario 1) </w:t>
             </w:r>
           </w:p>
         </w:tc>
@@ -6295,7 +6289,6 @@
               <w:rPr>
                 <w:rFonts w:ascii="Times New Roman" w:hAnsi="Times New Roman" w:cs="Times New Roman"/>
               </w:rPr>
-              <w:lastRenderedPageBreak/>
               <w:br/>
             </w:r>
           </w:p>
@@ -7040,7 +7033,14 @@
         <w:rPr>
           <w:rFonts w:ascii="Times New Roman" w:hAnsi="Times New Roman" w:cs="Times New Roman"/>
         </w:rPr>
-        <w:t xml:space="preserve"> percentile sits at 80.3 million, where there’s a 10% chance that this loss could exceed this value. Lastly, the maximum projected loss is $163 million, which represents the worst scenario. </w:t>
+        <w:t xml:space="preserve"> percentile sits at 80.3 million, where </w:t>
+      </w:r>
+      <w:r>
+        <w:rPr>
+          <w:rFonts w:ascii="Times New Roman" w:hAnsi="Times New Roman" w:cs="Times New Roman"/>
+        </w:rPr>
+        <w:lastRenderedPageBreak/>
+        <w:t xml:space="preserve">there’s a 10% chance that this loss could exceed this value. Lastly, the maximum projected loss is $163 million, which represents the worst scenario. </w:t>
       </w:r>
     </w:p>
     <w:p>
@@ -7053,7 +7053,6 @@
         <w:rPr>
           <w:noProof/>
         </w:rPr>
-        <w:lastRenderedPageBreak/>
         <w:drawing>
           <wp:inline distT="0" distB="0" distL="0" distR="0" wp14:anchorId="24233FDF" wp14:editId="3C58497E">
             <wp:extent cx="2324424" cy="3991532"/>
@@ -7220,7 +7219,6 @@
         <w:rPr>
           <w:rFonts w:ascii="Times New Roman" w:hAnsi="Times New Roman" w:cs="Times New Roman"/>
         </w:rPr>
-        <w:lastRenderedPageBreak/>
         <w:t>Scenario 2 - AE Accelerator Unpatched Vulnerability</w:t>
       </w:r>
       <w:bookmarkEnd w:id="17"/>
@@ -10513,7 +10511,6 @@
         <w:t xml:space="preserve">. LinkedIn. https://www.linkedin.com/pulse/insider-threats-exposed-financial-consequences-legal-case-vn4gf/ </w:t>
       </w:r>
     </w:p>
-    <w:p/>
     <w:sectPr>
       <w:headerReference w:type="default" r:id="rId29"/>
       <w:pgSz w:w="12240" w:h="15840"/>

</xml_diff>